<commit_message>
feat(docx): embed images directly into public ASAT Informatika docx files
</commit_message>
<xml_diff>
--- a/public/soal_asat_informatika_kelas_x.docx
+++ b/public/soal_asat_informatika_kelas_x.docx
@@ -4,7 +4,7 @@
   <w:body>
     <w:p>
       <w:pPr>
-        <w:spacing w:after="200"/>
+        <w:spacing w:after="150"/>
       </w:pPr>
       <w:r>
         <w:rPr>
@@ -19,7 +19,7 @@
     </w:p>
     <w:p>
       <w:pPr>
-        <w:spacing w:after="400"/>
+        <w:spacing w:after="350"/>
       </w:pPr>
       <w:r>
         <w:rPr>
@@ -29,12 +29,12 @@
           <w:sz w:val="22"/>
           <w:szCs w:val="22"/>
         </w:rPr>
-        <w:t xml:space="preserve">Format Standar Import Bank Soal EduVerse</w:t>
-      </w:r>
-    </w:p>
-    <w:p>
-      <w:pPr>
-        <w:spacing w:after="100" w:before="240"/>
+        <w:t xml:space="preserve">SMAN 19 Bandung - Format Terstandarisasi EduVerse (Lengkap dengan Gambar &amp; Kunci Jawaban)</w:t>
+      </w:r>
+    </w:p>
+    <w:p>
+      <w:pPr>
+        <w:spacing w:after="100" w:before="200"/>
       </w:pPr>
       <w:r>
         <w:rPr>
@@ -48,7 +48,7 @@
     </w:p>
     <w:p>
       <w:pPr>
-        <w:spacing w:after="60"/>
+        <w:spacing w:after="50"/>
         <w:ind w:left="400"/>
       </w:pPr>
       <w:r>
@@ -61,7 +61,7 @@
     </w:p>
     <w:p>
       <w:pPr>
-        <w:spacing w:after="60"/>
+        <w:spacing w:after="50"/>
         <w:ind w:left="400"/>
       </w:pPr>
       <w:r>
@@ -74,7 +74,7 @@
     </w:p>
     <w:p>
       <w:pPr>
-        <w:spacing w:after="60"/>
+        <w:spacing w:after="50"/>
         <w:ind w:left="400"/>
       </w:pPr>
       <w:r>
@@ -87,7 +87,7 @@
     </w:p>
     <w:p>
       <w:pPr>
-        <w:spacing w:after="60"/>
+        <w:spacing w:after="50"/>
         <w:ind w:left="400"/>
       </w:pPr>
       <w:r>
@@ -100,7 +100,7 @@
     </w:p>
     <w:p>
       <w:pPr>
-        <w:spacing w:after="60"/>
+        <w:spacing w:after="50"/>
         <w:ind w:left="400"/>
       </w:pPr>
       <w:r>
@@ -113,7 +113,7 @@
     </w:p>
     <w:p>
       <w:pPr>
-        <w:spacing w:after="200"/>
+        <w:spacing w:after="180" w:before="50"/>
         <w:ind w:left="400"/>
       </w:pPr>
       <w:r>
@@ -129,7 +129,7 @@
     </w:p>
     <w:p>
       <w:pPr>
-        <w:spacing w:after="100" w:before="240"/>
+        <w:spacing w:after="100" w:before="200"/>
       </w:pPr>
       <w:r>
         <w:rPr>
@@ -143,7 +143,7 @@
     </w:p>
     <w:p>
       <w:pPr>
-        <w:spacing w:after="60"/>
+        <w:spacing w:after="50"/>
         <w:ind w:left="400"/>
       </w:pPr>
       <w:r>
@@ -156,7 +156,7 @@
     </w:p>
     <w:p>
       <w:pPr>
-        <w:spacing w:after="60"/>
+        <w:spacing w:after="50"/>
         <w:ind w:left="400"/>
       </w:pPr>
       <w:r>
@@ -169,7 +169,7 @@
     </w:p>
     <w:p>
       <w:pPr>
-        <w:spacing w:after="60"/>
+        <w:spacing w:after="50"/>
         <w:ind w:left="400"/>
       </w:pPr>
       <w:r>
@@ -182,7 +182,7 @@
     </w:p>
     <w:p>
       <w:pPr>
-        <w:spacing w:after="60"/>
+        <w:spacing w:after="50"/>
         <w:ind w:left="400"/>
       </w:pPr>
       <w:r>
@@ -195,7 +195,7 @@
     </w:p>
     <w:p>
       <w:pPr>
-        <w:spacing w:after="60"/>
+        <w:spacing w:after="50"/>
         <w:ind w:left="400"/>
       </w:pPr>
       <w:r>
@@ -208,7 +208,7 @@
     </w:p>
     <w:p>
       <w:pPr>
-        <w:spacing w:after="200"/>
+        <w:spacing w:after="180" w:before="50"/>
         <w:ind w:left="400"/>
       </w:pPr>
       <w:r>
@@ -224,7 +224,7 @@
     </w:p>
     <w:p>
       <w:pPr>
-        <w:spacing w:after="100" w:before="240"/>
+        <w:spacing w:after="100" w:before="200"/>
       </w:pPr>
       <w:r>
         <w:rPr>
@@ -238,7 +238,7 @@
     </w:p>
     <w:p>
       <w:pPr>
-        <w:spacing w:after="60"/>
+        <w:spacing w:after="50"/>
         <w:ind w:left="400"/>
       </w:pPr>
       <w:r>
@@ -251,7 +251,7 @@
     </w:p>
     <w:p>
       <w:pPr>
-        <w:spacing w:after="60"/>
+        <w:spacing w:after="50"/>
         <w:ind w:left="400"/>
       </w:pPr>
       <w:r>
@@ -264,7 +264,7 @@
     </w:p>
     <w:p>
       <w:pPr>
-        <w:spacing w:after="60"/>
+        <w:spacing w:after="50"/>
         <w:ind w:left="400"/>
       </w:pPr>
       <w:r>
@@ -277,7 +277,7 @@
     </w:p>
     <w:p>
       <w:pPr>
-        <w:spacing w:after="60"/>
+        <w:spacing w:after="50"/>
         <w:ind w:left="400"/>
       </w:pPr>
       <w:r>
@@ -290,7 +290,7 @@
     </w:p>
     <w:p>
       <w:pPr>
-        <w:spacing w:after="60"/>
+        <w:spacing w:after="50"/>
         <w:ind w:left="400"/>
       </w:pPr>
       <w:r>
@@ -303,7 +303,7 @@
     </w:p>
     <w:p>
       <w:pPr>
-        <w:spacing w:after="200"/>
+        <w:spacing w:after="180" w:before="50"/>
         <w:ind w:left="400"/>
       </w:pPr>
       <w:r>
@@ -319,7 +319,7 @@
     </w:p>
     <w:p>
       <w:pPr>
-        <w:spacing w:after="100" w:before="240"/>
+        <w:spacing w:after="100" w:before="200"/>
       </w:pPr>
       <w:r>
         <w:rPr>
@@ -333,7 +333,7 @@
     </w:p>
     <w:p>
       <w:pPr>
-        <w:spacing w:after="60"/>
+        <w:spacing w:after="50"/>
         <w:ind w:left="400"/>
       </w:pPr>
       <w:r>
@@ -346,7 +346,7 @@
     </w:p>
     <w:p>
       <w:pPr>
-        <w:spacing w:after="60"/>
+        <w:spacing w:after="50"/>
         <w:ind w:left="400"/>
       </w:pPr>
       <w:r>
@@ -359,7 +359,7 @@
     </w:p>
     <w:p>
       <w:pPr>
-        <w:spacing w:after="60"/>
+        <w:spacing w:after="50"/>
         <w:ind w:left="400"/>
       </w:pPr>
       <w:r>
@@ -372,7 +372,7 @@
     </w:p>
     <w:p>
       <w:pPr>
-        <w:spacing w:after="60"/>
+        <w:spacing w:after="50"/>
         <w:ind w:left="400"/>
       </w:pPr>
       <w:r>
@@ -385,7 +385,7 @@
     </w:p>
     <w:p>
       <w:pPr>
-        <w:spacing w:after="60"/>
+        <w:spacing w:after="50"/>
         <w:ind w:left="400"/>
       </w:pPr>
       <w:r>
@@ -398,7 +398,7 @@
     </w:p>
     <w:p>
       <w:pPr>
-        <w:spacing w:after="200"/>
+        <w:spacing w:after="180" w:before="50"/>
         <w:ind w:left="400"/>
       </w:pPr>
       <w:r>
@@ -414,7 +414,7 @@
     </w:p>
     <w:p>
       <w:pPr>
-        <w:spacing w:after="100" w:before="240"/>
+        <w:spacing w:after="100" w:before="200"/>
       </w:pPr>
       <w:r>
         <w:rPr>
@@ -428,7 +428,7 @@
     </w:p>
     <w:p>
       <w:pPr>
-        <w:spacing w:after="60"/>
+        <w:spacing w:after="50"/>
         <w:ind w:left="400"/>
       </w:pPr>
       <w:r>
@@ -441,7 +441,7 @@
     </w:p>
     <w:p>
       <w:pPr>
-        <w:spacing w:after="60"/>
+        <w:spacing w:after="50"/>
         <w:ind w:left="400"/>
       </w:pPr>
       <w:r>
@@ -454,7 +454,7 @@
     </w:p>
     <w:p>
       <w:pPr>
-        <w:spacing w:after="60"/>
+        <w:spacing w:after="50"/>
         <w:ind w:left="400"/>
       </w:pPr>
       <w:r>
@@ -467,7 +467,7 @@
     </w:p>
     <w:p>
       <w:pPr>
-        <w:spacing w:after="60"/>
+        <w:spacing w:after="50"/>
         <w:ind w:left="400"/>
       </w:pPr>
       <w:r>
@@ -480,7 +480,7 @@
     </w:p>
     <w:p>
       <w:pPr>
-        <w:spacing w:after="60"/>
+        <w:spacing w:after="50"/>
         <w:ind w:left="400"/>
       </w:pPr>
       <w:r>
@@ -493,7 +493,7 @@
     </w:p>
     <w:p>
       <w:pPr>
-        <w:spacing w:after="200"/>
+        <w:spacing w:after="180" w:before="50"/>
         <w:ind w:left="400"/>
       </w:pPr>
       <w:r>
@@ -509,7 +509,7 @@
     </w:p>
     <w:p>
       <w:pPr>
-        <w:spacing w:after="100" w:before="240"/>
+        <w:spacing w:after="100" w:before="200"/>
       </w:pPr>
       <w:r>
         <w:rPr>
@@ -523,7 +523,7 @@
     </w:p>
     <w:p>
       <w:pPr>
-        <w:spacing w:after="60"/>
+        <w:spacing w:after="50"/>
         <w:ind w:left="400"/>
       </w:pPr>
       <w:r>
@@ -536,7 +536,7 @@
     </w:p>
     <w:p>
       <w:pPr>
-        <w:spacing w:after="60"/>
+        <w:spacing w:after="50"/>
         <w:ind w:left="400"/>
       </w:pPr>
       <w:r>
@@ -549,7 +549,7 @@
     </w:p>
     <w:p>
       <w:pPr>
-        <w:spacing w:after="60"/>
+        <w:spacing w:after="50"/>
         <w:ind w:left="400"/>
       </w:pPr>
       <w:r>
@@ -562,7 +562,7 @@
     </w:p>
     <w:p>
       <w:pPr>
-        <w:spacing w:after="60"/>
+        <w:spacing w:after="50"/>
         <w:ind w:left="400"/>
       </w:pPr>
       <w:r>
@@ -575,7 +575,7 @@
     </w:p>
     <w:p>
       <w:pPr>
-        <w:spacing w:after="60"/>
+        <w:spacing w:after="50"/>
         <w:ind w:left="400"/>
       </w:pPr>
       <w:r>
@@ -588,7 +588,7 @@
     </w:p>
     <w:p>
       <w:pPr>
-        <w:spacing w:after="200"/>
+        <w:spacing w:after="180" w:before="50"/>
         <w:ind w:left="400"/>
       </w:pPr>
       <w:r>
@@ -604,7 +604,7 @@
     </w:p>
     <w:p>
       <w:pPr>
-        <w:spacing w:after="100" w:before="240"/>
+        <w:spacing w:after="100" w:before="200"/>
       </w:pPr>
       <w:r>
         <w:rPr>
@@ -618,7 +618,7 @@
     </w:p>
     <w:p>
       <w:pPr>
-        <w:spacing w:after="60"/>
+        <w:spacing w:after="50"/>
         <w:ind w:left="400"/>
       </w:pPr>
       <w:r>
@@ -631,7 +631,7 @@
     </w:p>
     <w:p>
       <w:pPr>
-        <w:spacing w:after="60"/>
+        <w:spacing w:after="50"/>
         <w:ind w:left="400"/>
       </w:pPr>
       <w:r>
@@ -644,7 +644,7 @@
     </w:p>
     <w:p>
       <w:pPr>
-        <w:spacing w:after="60"/>
+        <w:spacing w:after="50"/>
         <w:ind w:left="400"/>
       </w:pPr>
       <w:r>
@@ -657,7 +657,7 @@
     </w:p>
     <w:p>
       <w:pPr>
-        <w:spacing w:after="60"/>
+        <w:spacing w:after="50"/>
         <w:ind w:left="400"/>
       </w:pPr>
       <w:r>
@@ -670,7 +670,7 @@
     </w:p>
     <w:p>
       <w:pPr>
-        <w:spacing w:after="60"/>
+        <w:spacing w:after="50"/>
         <w:ind w:left="400"/>
       </w:pPr>
       <w:r>
@@ -683,7 +683,7 @@
     </w:p>
     <w:p>
       <w:pPr>
-        <w:spacing w:after="200"/>
+        <w:spacing w:after="180" w:before="50"/>
         <w:ind w:left="400"/>
       </w:pPr>
       <w:r>
@@ -699,7 +699,7 @@
     </w:p>
     <w:p>
       <w:pPr>
-        <w:spacing w:after="100" w:before="240"/>
+        <w:spacing w:after="100" w:before="200"/>
       </w:pPr>
       <w:r>
         <w:rPr>
@@ -713,7 +713,7 @@
     </w:p>
     <w:p>
       <w:pPr>
-        <w:spacing w:after="60"/>
+        <w:spacing w:after="50"/>
         <w:ind w:left="400"/>
       </w:pPr>
       <w:r>
@@ -726,7 +726,7 @@
     </w:p>
     <w:p>
       <w:pPr>
-        <w:spacing w:after="60"/>
+        <w:spacing w:after="50"/>
         <w:ind w:left="400"/>
       </w:pPr>
       <w:r>
@@ -739,7 +739,7 @@
     </w:p>
     <w:p>
       <w:pPr>
-        <w:spacing w:after="60"/>
+        <w:spacing w:after="50"/>
         <w:ind w:left="400"/>
       </w:pPr>
       <w:r>
@@ -752,7 +752,7 @@
     </w:p>
     <w:p>
       <w:pPr>
-        <w:spacing w:after="60"/>
+        <w:spacing w:after="50"/>
         <w:ind w:left="400"/>
       </w:pPr>
       <w:r>
@@ -765,7 +765,7 @@
     </w:p>
     <w:p>
       <w:pPr>
-        <w:spacing w:after="60"/>
+        <w:spacing w:after="50"/>
         <w:ind w:left="400"/>
       </w:pPr>
       <w:r>
@@ -778,7 +778,7 @@
     </w:p>
     <w:p>
       <w:pPr>
-        <w:spacing w:after="200"/>
+        <w:spacing w:after="180" w:before="50"/>
         <w:ind w:left="400"/>
       </w:pPr>
       <w:r>
@@ -794,7 +794,7 @@
     </w:p>
     <w:p>
       <w:pPr>
-        <w:spacing w:after="100" w:before="240"/>
+        <w:spacing w:after="100" w:before="200"/>
       </w:pPr>
       <w:r>
         <w:rPr>
@@ -808,7 +808,53 @@
     </w:p>
     <w:p>
       <w:pPr>
-        <w:spacing w:after="60"/>
+        <w:spacing w:after="140"/>
+        <w:ind w:left="400"/>
+      </w:pPr>
+      <w:r>
+        <w:drawing>
+          <wp:inline distT="0" distB="0" distL="0" distR="0">
+            <wp:extent cx="3048000" cy="2000250"/>
+            <wp:effectExtent t="0" r="0" b="0" l="0"/>
+            <wp:docPr id="1" name="" descr="" title=""/>
+            <wp:cNvGraphicFramePr>
+              <a:graphicFrameLocks xmlns:a="http://schemas.openxmlformats.org/drawingml/2006/main" noChangeAspect="1"/>
+            </wp:cNvGraphicFramePr>
+            <a:graphic xmlns:a="http://schemas.openxmlformats.org/drawingml/2006/main">
+              <a:graphicData uri="http://schemas.openxmlformats.org/drawingml/2006/picture">
+                <pic:pic xmlns:pic="http://schemas.openxmlformats.org/drawingml/2006/picture">
+                  <pic:nvPicPr>
+                    <pic:cNvPr id="0" name="" descr=""/>
+                    <pic:cNvPicPr>
+                      <a:picLocks noChangeAspect="1" noChangeArrowheads="1"/>
+                    </pic:cNvPicPr>
+                  </pic:nvPicPr>
+                  <pic:blipFill>
+                    <a:blip r:embed="rId7" cstate="none"/>
+                    <a:srcRect/>
+                    <a:stretch>
+                      <a:fillRect/>
+                    </a:stretch>
+                  </pic:blipFill>
+                  <pic:spPr bwMode="auto">
+                    <a:xfrm>
+                      <a:off x="0" y="0"/>
+                      <a:ext cx="3048000" cy="2000250"/>
+                    </a:xfrm>
+                    <a:prstGeom prst="rect">
+                      <a:avLst/>
+                    </a:prstGeom>
+                  </pic:spPr>
+                </pic:pic>
+              </a:graphicData>
+            </a:graphic>
+          </wp:inline>
+        </w:drawing>
+      </w:r>
+    </w:p>
+    <w:p>
+      <w:pPr>
+        <w:spacing w:after="50"/>
         <w:ind w:left="400"/>
       </w:pPr>
       <w:r>
@@ -821,7 +867,7 @@
     </w:p>
     <w:p>
       <w:pPr>
-        <w:spacing w:after="60"/>
+        <w:spacing w:after="50"/>
         <w:ind w:left="400"/>
       </w:pPr>
       <w:r>
@@ -834,7 +880,7 @@
     </w:p>
     <w:p>
       <w:pPr>
-        <w:spacing w:after="60"/>
+        <w:spacing w:after="50"/>
         <w:ind w:left="400"/>
       </w:pPr>
       <w:r>
@@ -847,7 +893,7 @@
     </w:p>
     <w:p>
       <w:pPr>
-        <w:spacing w:after="60"/>
+        <w:spacing w:after="50"/>
         <w:ind w:left="400"/>
       </w:pPr>
       <w:r>
@@ -860,7 +906,7 @@
     </w:p>
     <w:p>
       <w:pPr>
-        <w:spacing w:after="60"/>
+        <w:spacing w:after="50"/>
         <w:ind w:left="400"/>
       </w:pPr>
       <w:r>
@@ -873,7 +919,7 @@
     </w:p>
     <w:p>
       <w:pPr>
-        <w:spacing w:after="200"/>
+        <w:spacing w:after="180" w:before="50"/>
         <w:ind w:left="400"/>
       </w:pPr>
       <w:r>
@@ -889,7 +935,7 @@
     </w:p>
     <w:p>
       <w:pPr>
-        <w:spacing w:after="100" w:before="240"/>
+        <w:spacing w:after="100" w:before="200"/>
       </w:pPr>
       <w:r>
         <w:rPr>
@@ -903,7 +949,7 @@
     </w:p>
     <w:p>
       <w:pPr>
-        <w:spacing w:after="60"/>
+        <w:spacing w:after="50"/>
         <w:ind w:left="400"/>
       </w:pPr>
       <w:r>
@@ -916,7 +962,7 @@
     </w:p>
     <w:p>
       <w:pPr>
-        <w:spacing w:after="60"/>
+        <w:spacing w:after="50"/>
         <w:ind w:left="400"/>
       </w:pPr>
       <w:r>
@@ -929,7 +975,7 @@
     </w:p>
     <w:p>
       <w:pPr>
-        <w:spacing w:after="60"/>
+        <w:spacing w:after="50"/>
         <w:ind w:left="400"/>
       </w:pPr>
       <w:r>
@@ -942,7 +988,7 @@
     </w:p>
     <w:p>
       <w:pPr>
-        <w:spacing w:after="60"/>
+        <w:spacing w:after="50"/>
         <w:ind w:left="400"/>
       </w:pPr>
       <w:r>
@@ -955,7 +1001,7 @@
     </w:p>
     <w:p>
       <w:pPr>
-        <w:spacing w:after="60"/>
+        <w:spacing w:after="50"/>
         <w:ind w:left="400"/>
       </w:pPr>
       <w:r>
@@ -968,7 +1014,7 @@
     </w:p>
     <w:p>
       <w:pPr>
-        <w:spacing w:after="200"/>
+        <w:spacing w:after="180" w:before="50"/>
         <w:ind w:left="400"/>
       </w:pPr>
       <w:r>
@@ -984,7 +1030,7 @@
     </w:p>
     <w:p>
       <w:pPr>
-        <w:spacing w:after="100" w:before="240"/>
+        <w:spacing w:after="100" w:before="200"/>
       </w:pPr>
       <w:r>
         <w:rPr>
@@ -998,7 +1044,7 @@
     </w:p>
     <w:p>
       <w:pPr>
-        <w:spacing w:after="60"/>
+        <w:spacing w:after="50"/>
         <w:ind w:left="400"/>
       </w:pPr>
       <w:r>
@@ -1011,7 +1057,7 @@
     </w:p>
     <w:p>
       <w:pPr>
-        <w:spacing w:after="60"/>
+        <w:spacing w:after="50"/>
         <w:ind w:left="400"/>
       </w:pPr>
       <w:r>
@@ -1024,7 +1070,7 @@
     </w:p>
     <w:p>
       <w:pPr>
-        <w:spacing w:after="60"/>
+        <w:spacing w:after="50"/>
         <w:ind w:left="400"/>
       </w:pPr>
       <w:r>
@@ -1037,7 +1083,7 @@
     </w:p>
     <w:p>
       <w:pPr>
-        <w:spacing w:after="60"/>
+        <w:spacing w:after="50"/>
         <w:ind w:left="400"/>
       </w:pPr>
       <w:r>
@@ -1050,7 +1096,7 @@
     </w:p>
     <w:p>
       <w:pPr>
-        <w:spacing w:after="60"/>
+        <w:spacing w:after="50"/>
         <w:ind w:left="400"/>
       </w:pPr>
       <w:r>
@@ -1063,7 +1109,7 @@
     </w:p>
     <w:p>
       <w:pPr>
-        <w:spacing w:after="200"/>
+        <w:spacing w:after="180" w:before="50"/>
         <w:ind w:left="400"/>
       </w:pPr>
       <w:r>
@@ -1079,7 +1125,7 @@
     </w:p>
     <w:p>
       <w:pPr>
-        <w:spacing w:after="100" w:before="240"/>
+        <w:spacing w:after="100" w:before="200"/>
       </w:pPr>
       <w:r>
         <w:rPr>
@@ -1093,7 +1139,53 @@
     </w:p>
     <w:p>
       <w:pPr>
-        <w:spacing w:after="60"/>
+        <w:spacing w:after="140"/>
+        <w:ind w:left="400"/>
+      </w:pPr>
+      <w:r>
+        <w:drawing>
+          <wp:inline distT="0" distB="0" distL="0" distR="0">
+            <wp:extent cx="3048000" cy="2000250"/>
+            <wp:effectExtent t="0" r="0" b="0" l="0"/>
+            <wp:docPr id="1" name="" descr="" title=""/>
+            <wp:cNvGraphicFramePr>
+              <a:graphicFrameLocks xmlns:a="http://schemas.openxmlformats.org/drawingml/2006/main" noChangeAspect="1"/>
+            </wp:cNvGraphicFramePr>
+            <a:graphic xmlns:a="http://schemas.openxmlformats.org/drawingml/2006/main">
+              <a:graphicData uri="http://schemas.openxmlformats.org/drawingml/2006/picture">
+                <pic:pic xmlns:pic="http://schemas.openxmlformats.org/drawingml/2006/picture">
+                  <pic:nvPicPr>
+                    <pic:cNvPr id="0" name="" descr=""/>
+                    <pic:cNvPicPr>
+                      <a:picLocks noChangeAspect="1" noChangeArrowheads="1"/>
+                    </pic:cNvPicPr>
+                  </pic:nvPicPr>
+                  <pic:blipFill>
+                    <a:blip r:embed="rId8" cstate="none"/>
+                    <a:srcRect/>
+                    <a:stretch>
+                      <a:fillRect/>
+                    </a:stretch>
+                  </pic:blipFill>
+                  <pic:spPr bwMode="auto">
+                    <a:xfrm>
+                      <a:off x="0" y="0"/>
+                      <a:ext cx="3048000" cy="2000250"/>
+                    </a:xfrm>
+                    <a:prstGeom prst="rect">
+                      <a:avLst/>
+                    </a:prstGeom>
+                  </pic:spPr>
+                </pic:pic>
+              </a:graphicData>
+            </a:graphic>
+          </wp:inline>
+        </w:drawing>
+      </w:r>
+    </w:p>
+    <w:p>
+      <w:pPr>
+        <w:spacing w:after="50"/>
         <w:ind w:left="400"/>
       </w:pPr>
       <w:r>
@@ -1106,7 +1198,7 @@
     </w:p>
     <w:p>
       <w:pPr>
-        <w:spacing w:after="60"/>
+        <w:spacing w:after="50"/>
         <w:ind w:left="400"/>
       </w:pPr>
       <w:r>
@@ -1119,7 +1211,7 @@
     </w:p>
     <w:p>
       <w:pPr>
-        <w:spacing w:after="60"/>
+        <w:spacing w:after="50"/>
         <w:ind w:left="400"/>
       </w:pPr>
       <w:r>
@@ -1132,7 +1224,7 @@
     </w:p>
     <w:p>
       <w:pPr>
-        <w:spacing w:after="60"/>
+        <w:spacing w:after="50"/>
         <w:ind w:left="400"/>
       </w:pPr>
       <w:r>
@@ -1145,7 +1237,7 @@
     </w:p>
     <w:p>
       <w:pPr>
-        <w:spacing w:after="60"/>
+        <w:spacing w:after="50"/>
         <w:ind w:left="400"/>
       </w:pPr>
       <w:r>
@@ -1158,7 +1250,7 @@
     </w:p>
     <w:p>
       <w:pPr>
-        <w:spacing w:after="200"/>
+        <w:spacing w:after="180" w:before="50"/>
         <w:ind w:left="400"/>
       </w:pPr>
       <w:r>
@@ -1174,7 +1266,7 @@
     </w:p>
     <w:p>
       <w:pPr>
-        <w:spacing w:after="100" w:before="240"/>
+        <w:spacing w:after="100" w:before="200"/>
       </w:pPr>
       <w:r>
         <w:rPr>
@@ -1188,7 +1280,7 @@
     </w:p>
     <w:p>
       <w:pPr>
-        <w:spacing w:after="60"/>
+        <w:spacing w:after="50"/>
         <w:ind w:left="400"/>
       </w:pPr>
       <w:r>
@@ -1201,7 +1293,7 @@
     </w:p>
     <w:p>
       <w:pPr>
-        <w:spacing w:after="60"/>
+        <w:spacing w:after="50"/>
         <w:ind w:left="400"/>
       </w:pPr>
       <w:r>
@@ -1214,7 +1306,7 @@
     </w:p>
     <w:p>
       <w:pPr>
-        <w:spacing w:after="60"/>
+        <w:spacing w:after="50"/>
         <w:ind w:left="400"/>
       </w:pPr>
       <w:r>
@@ -1227,7 +1319,7 @@
     </w:p>
     <w:p>
       <w:pPr>
-        <w:spacing w:after="60"/>
+        <w:spacing w:after="50"/>
         <w:ind w:left="400"/>
       </w:pPr>
       <w:r>
@@ -1240,7 +1332,7 @@
     </w:p>
     <w:p>
       <w:pPr>
-        <w:spacing w:after="60"/>
+        <w:spacing w:after="50"/>
         <w:ind w:left="400"/>
       </w:pPr>
       <w:r>
@@ -1253,7 +1345,7 @@
     </w:p>
     <w:p>
       <w:pPr>
-        <w:spacing w:after="200"/>
+        <w:spacing w:after="180" w:before="50"/>
         <w:ind w:left="400"/>
       </w:pPr>
       <w:r>
@@ -1269,7 +1361,7 @@
     </w:p>
     <w:p>
       <w:pPr>
-        <w:spacing w:after="100" w:before="240"/>
+        <w:spacing w:after="100" w:before="200"/>
       </w:pPr>
       <w:r>
         <w:rPr>
@@ -1283,7 +1375,7 @@
     </w:p>
     <w:p>
       <w:pPr>
-        <w:spacing w:after="60"/>
+        <w:spacing w:after="50"/>
         <w:ind w:left="400"/>
       </w:pPr>
       <w:r>
@@ -1296,7 +1388,53 @@
     </w:p>
     <w:p>
       <w:pPr>
-        <w:spacing w:after="60"/>
+        <w:spacing w:after="80"/>
+        <w:ind w:left="600"/>
+      </w:pPr>
+      <w:r>
+        <w:drawing>
+          <wp:inline distT="0" distB="0" distL="0" distR="0">
+            <wp:extent cx="1905000" cy="1238250"/>
+            <wp:effectExtent t="0" r="0" b="0" l="0"/>
+            <wp:docPr id="1" name="" descr="" title=""/>
+            <wp:cNvGraphicFramePr>
+              <a:graphicFrameLocks xmlns:a="http://schemas.openxmlformats.org/drawingml/2006/main" noChangeAspect="1"/>
+            </wp:cNvGraphicFramePr>
+            <a:graphic xmlns:a="http://schemas.openxmlformats.org/drawingml/2006/main">
+              <a:graphicData uri="http://schemas.openxmlformats.org/drawingml/2006/picture">
+                <pic:pic xmlns:pic="http://schemas.openxmlformats.org/drawingml/2006/picture">
+                  <pic:nvPicPr>
+                    <pic:cNvPr id="0" name="" descr=""/>
+                    <pic:cNvPicPr>
+                      <a:picLocks noChangeAspect="1" noChangeArrowheads="1"/>
+                    </pic:cNvPicPr>
+                  </pic:nvPicPr>
+                  <pic:blipFill>
+                    <a:blip r:embed="rId9" cstate="none"/>
+                    <a:srcRect/>
+                    <a:stretch>
+                      <a:fillRect/>
+                    </a:stretch>
+                  </pic:blipFill>
+                  <pic:spPr bwMode="auto">
+                    <a:xfrm>
+                      <a:off x="0" y="0"/>
+                      <a:ext cx="1905000" cy="1238250"/>
+                    </a:xfrm>
+                    <a:prstGeom prst="rect">
+                      <a:avLst/>
+                    </a:prstGeom>
+                  </pic:spPr>
+                </pic:pic>
+              </a:graphicData>
+            </a:graphic>
+          </wp:inline>
+        </w:drawing>
+      </w:r>
+    </w:p>
+    <w:p>
+      <w:pPr>
+        <w:spacing w:after="50"/>
         <w:ind w:left="400"/>
       </w:pPr>
       <w:r>
@@ -1309,7 +1447,53 @@
     </w:p>
     <w:p>
       <w:pPr>
-        <w:spacing w:after="60"/>
+        <w:spacing w:after="80"/>
+        <w:ind w:left="600"/>
+      </w:pPr>
+      <w:r>
+        <w:drawing>
+          <wp:inline distT="0" distB="0" distL="0" distR="0">
+            <wp:extent cx="1905000" cy="1238250"/>
+            <wp:effectExtent t="0" r="0" b="0" l="0"/>
+            <wp:docPr id="1" name="" descr="" title=""/>
+            <wp:cNvGraphicFramePr>
+              <a:graphicFrameLocks xmlns:a="http://schemas.openxmlformats.org/drawingml/2006/main" noChangeAspect="1"/>
+            </wp:cNvGraphicFramePr>
+            <a:graphic xmlns:a="http://schemas.openxmlformats.org/drawingml/2006/main">
+              <a:graphicData uri="http://schemas.openxmlformats.org/drawingml/2006/picture">
+                <pic:pic xmlns:pic="http://schemas.openxmlformats.org/drawingml/2006/picture">
+                  <pic:nvPicPr>
+                    <pic:cNvPr id="0" name="" descr=""/>
+                    <pic:cNvPicPr>
+                      <a:picLocks noChangeAspect="1" noChangeArrowheads="1"/>
+                    </pic:cNvPicPr>
+                  </pic:nvPicPr>
+                  <pic:blipFill>
+                    <a:blip r:embed="rId10" cstate="none"/>
+                    <a:srcRect/>
+                    <a:stretch>
+                      <a:fillRect/>
+                    </a:stretch>
+                  </pic:blipFill>
+                  <pic:spPr bwMode="auto">
+                    <a:xfrm>
+                      <a:off x="0" y="0"/>
+                      <a:ext cx="1905000" cy="1238250"/>
+                    </a:xfrm>
+                    <a:prstGeom prst="rect">
+                      <a:avLst/>
+                    </a:prstGeom>
+                  </pic:spPr>
+                </pic:pic>
+              </a:graphicData>
+            </a:graphic>
+          </wp:inline>
+        </w:drawing>
+      </w:r>
+    </w:p>
+    <w:p>
+      <w:pPr>
+        <w:spacing w:after="50"/>
         <w:ind w:left="400"/>
       </w:pPr>
       <w:r>
@@ -1322,7 +1506,53 @@
     </w:p>
     <w:p>
       <w:pPr>
-        <w:spacing w:after="60"/>
+        <w:spacing w:after="80"/>
+        <w:ind w:left="600"/>
+      </w:pPr>
+      <w:r>
+        <w:drawing>
+          <wp:inline distT="0" distB="0" distL="0" distR="0">
+            <wp:extent cx="1905000" cy="1238250"/>
+            <wp:effectExtent t="0" r="0" b="0" l="0"/>
+            <wp:docPr id="1" name="" descr="" title=""/>
+            <wp:cNvGraphicFramePr>
+              <a:graphicFrameLocks xmlns:a="http://schemas.openxmlformats.org/drawingml/2006/main" noChangeAspect="1"/>
+            </wp:cNvGraphicFramePr>
+            <a:graphic xmlns:a="http://schemas.openxmlformats.org/drawingml/2006/main">
+              <a:graphicData uri="http://schemas.openxmlformats.org/drawingml/2006/picture">
+                <pic:pic xmlns:pic="http://schemas.openxmlformats.org/drawingml/2006/picture">
+                  <pic:nvPicPr>
+                    <pic:cNvPr id="0" name="" descr=""/>
+                    <pic:cNvPicPr>
+                      <a:picLocks noChangeAspect="1" noChangeArrowheads="1"/>
+                    </pic:cNvPicPr>
+                  </pic:nvPicPr>
+                  <pic:blipFill>
+                    <a:blip r:embed="rId11" cstate="none"/>
+                    <a:srcRect/>
+                    <a:stretch>
+                      <a:fillRect/>
+                    </a:stretch>
+                  </pic:blipFill>
+                  <pic:spPr bwMode="auto">
+                    <a:xfrm>
+                      <a:off x="0" y="0"/>
+                      <a:ext cx="1905000" cy="1238250"/>
+                    </a:xfrm>
+                    <a:prstGeom prst="rect">
+                      <a:avLst/>
+                    </a:prstGeom>
+                  </pic:spPr>
+                </pic:pic>
+              </a:graphicData>
+            </a:graphic>
+          </wp:inline>
+        </w:drawing>
+      </w:r>
+    </w:p>
+    <w:p>
+      <w:pPr>
+        <w:spacing w:after="50"/>
         <w:ind w:left="400"/>
       </w:pPr>
       <w:r>
@@ -1335,7 +1565,53 @@
     </w:p>
     <w:p>
       <w:pPr>
-        <w:spacing w:after="60"/>
+        <w:spacing w:after="80"/>
+        <w:ind w:left="600"/>
+      </w:pPr>
+      <w:r>
+        <w:drawing>
+          <wp:inline distT="0" distB="0" distL="0" distR="0">
+            <wp:extent cx="1905000" cy="1238250"/>
+            <wp:effectExtent t="0" r="0" b="0" l="0"/>
+            <wp:docPr id="1" name="" descr="" title=""/>
+            <wp:cNvGraphicFramePr>
+              <a:graphicFrameLocks xmlns:a="http://schemas.openxmlformats.org/drawingml/2006/main" noChangeAspect="1"/>
+            </wp:cNvGraphicFramePr>
+            <a:graphic xmlns:a="http://schemas.openxmlformats.org/drawingml/2006/main">
+              <a:graphicData uri="http://schemas.openxmlformats.org/drawingml/2006/picture">
+                <pic:pic xmlns:pic="http://schemas.openxmlformats.org/drawingml/2006/picture">
+                  <pic:nvPicPr>
+                    <pic:cNvPr id="0" name="" descr=""/>
+                    <pic:cNvPicPr>
+                      <a:picLocks noChangeAspect="1" noChangeArrowheads="1"/>
+                    </pic:cNvPicPr>
+                  </pic:nvPicPr>
+                  <pic:blipFill>
+                    <a:blip r:embed="rId12" cstate="none"/>
+                    <a:srcRect/>
+                    <a:stretch>
+                      <a:fillRect/>
+                    </a:stretch>
+                  </pic:blipFill>
+                  <pic:spPr bwMode="auto">
+                    <a:xfrm>
+                      <a:off x="0" y="0"/>
+                      <a:ext cx="1905000" cy="1238250"/>
+                    </a:xfrm>
+                    <a:prstGeom prst="rect">
+                      <a:avLst/>
+                    </a:prstGeom>
+                  </pic:spPr>
+                </pic:pic>
+              </a:graphicData>
+            </a:graphic>
+          </wp:inline>
+        </w:drawing>
+      </w:r>
+    </w:p>
+    <w:p>
+      <w:pPr>
+        <w:spacing w:after="50"/>
         <w:ind w:left="400"/>
       </w:pPr>
       <w:r>
@@ -1348,7 +1624,53 @@
     </w:p>
     <w:p>
       <w:pPr>
-        <w:spacing w:after="200"/>
+        <w:spacing w:after="80"/>
+        <w:ind w:left="600"/>
+      </w:pPr>
+      <w:r>
+        <w:drawing>
+          <wp:inline distT="0" distB="0" distL="0" distR="0">
+            <wp:extent cx="1905000" cy="1238250"/>
+            <wp:effectExtent t="0" r="0" b="0" l="0"/>
+            <wp:docPr id="1" name="" descr="" title=""/>
+            <wp:cNvGraphicFramePr>
+              <a:graphicFrameLocks xmlns:a="http://schemas.openxmlformats.org/drawingml/2006/main" noChangeAspect="1"/>
+            </wp:cNvGraphicFramePr>
+            <a:graphic xmlns:a="http://schemas.openxmlformats.org/drawingml/2006/main">
+              <a:graphicData uri="http://schemas.openxmlformats.org/drawingml/2006/picture">
+                <pic:pic xmlns:pic="http://schemas.openxmlformats.org/drawingml/2006/picture">
+                  <pic:nvPicPr>
+                    <pic:cNvPr id="0" name="" descr=""/>
+                    <pic:cNvPicPr>
+                      <a:picLocks noChangeAspect="1" noChangeArrowheads="1"/>
+                    </pic:cNvPicPr>
+                  </pic:nvPicPr>
+                  <pic:blipFill>
+                    <a:blip r:embed="rId13" cstate="none"/>
+                    <a:srcRect/>
+                    <a:stretch>
+                      <a:fillRect/>
+                    </a:stretch>
+                  </pic:blipFill>
+                  <pic:spPr bwMode="auto">
+                    <a:xfrm>
+                      <a:off x="0" y="0"/>
+                      <a:ext cx="1905000" cy="1238250"/>
+                    </a:xfrm>
+                    <a:prstGeom prst="rect">
+                      <a:avLst/>
+                    </a:prstGeom>
+                  </pic:spPr>
+                </pic:pic>
+              </a:graphicData>
+            </a:graphic>
+          </wp:inline>
+        </w:drawing>
+      </w:r>
+    </w:p>
+    <w:p>
+      <w:pPr>
+        <w:spacing w:after="180" w:before="50"/>
         <w:ind w:left="400"/>
       </w:pPr>
       <w:r>
@@ -1364,7 +1686,7 @@
     </w:p>
     <w:p>
       <w:pPr>
-        <w:spacing w:after="100" w:before="240"/>
+        <w:spacing w:after="100" w:before="200"/>
       </w:pPr>
       <w:r>
         <w:rPr>
@@ -1378,7 +1700,7 @@
     </w:p>
     <w:p>
       <w:pPr>
-        <w:spacing w:after="60"/>
+        <w:spacing w:after="50"/>
         <w:ind w:left="400"/>
       </w:pPr>
       <w:r>
@@ -1391,7 +1713,53 @@
     </w:p>
     <w:p>
       <w:pPr>
-        <w:spacing w:after="60"/>
+        <w:spacing w:after="80"/>
+        <w:ind w:left="600"/>
+      </w:pPr>
+      <w:r>
+        <w:drawing>
+          <wp:inline distT="0" distB="0" distL="0" distR="0">
+            <wp:extent cx="1905000" cy="1238250"/>
+            <wp:effectExtent t="0" r="0" b="0" l="0"/>
+            <wp:docPr id="1" name="" descr="" title=""/>
+            <wp:cNvGraphicFramePr>
+              <a:graphicFrameLocks xmlns:a="http://schemas.openxmlformats.org/drawingml/2006/main" noChangeAspect="1"/>
+            </wp:cNvGraphicFramePr>
+            <a:graphic xmlns:a="http://schemas.openxmlformats.org/drawingml/2006/main">
+              <a:graphicData uri="http://schemas.openxmlformats.org/drawingml/2006/picture">
+                <pic:pic xmlns:pic="http://schemas.openxmlformats.org/drawingml/2006/picture">
+                  <pic:nvPicPr>
+                    <pic:cNvPr id="0" name="" descr=""/>
+                    <pic:cNvPicPr>
+                      <a:picLocks noChangeAspect="1" noChangeArrowheads="1"/>
+                    </pic:cNvPicPr>
+                  </pic:nvPicPr>
+                  <pic:blipFill>
+                    <a:blip r:embed="rId12" cstate="none"/>
+                    <a:srcRect/>
+                    <a:stretch>
+                      <a:fillRect/>
+                    </a:stretch>
+                  </pic:blipFill>
+                  <pic:spPr bwMode="auto">
+                    <a:xfrm>
+                      <a:off x="0" y="0"/>
+                      <a:ext cx="1905000" cy="1238250"/>
+                    </a:xfrm>
+                    <a:prstGeom prst="rect">
+                      <a:avLst/>
+                    </a:prstGeom>
+                  </pic:spPr>
+                </pic:pic>
+              </a:graphicData>
+            </a:graphic>
+          </wp:inline>
+        </w:drawing>
+      </w:r>
+    </w:p>
+    <w:p>
+      <w:pPr>
+        <w:spacing w:after="50"/>
         <w:ind w:left="400"/>
       </w:pPr>
       <w:r>
@@ -1404,7 +1772,53 @@
     </w:p>
     <w:p>
       <w:pPr>
-        <w:spacing w:after="60"/>
+        <w:spacing w:after="80"/>
+        <w:ind w:left="600"/>
+      </w:pPr>
+      <w:r>
+        <w:drawing>
+          <wp:inline distT="0" distB="0" distL="0" distR="0">
+            <wp:extent cx="1905000" cy="1238250"/>
+            <wp:effectExtent t="0" r="0" b="0" l="0"/>
+            <wp:docPr id="1" name="" descr="" title=""/>
+            <wp:cNvGraphicFramePr>
+              <a:graphicFrameLocks xmlns:a="http://schemas.openxmlformats.org/drawingml/2006/main" noChangeAspect="1"/>
+            </wp:cNvGraphicFramePr>
+            <a:graphic xmlns:a="http://schemas.openxmlformats.org/drawingml/2006/main">
+              <a:graphicData uri="http://schemas.openxmlformats.org/drawingml/2006/picture">
+                <pic:pic xmlns:pic="http://schemas.openxmlformats.org/drawingml/2006/picture">
+                  <pic:nvPicPr>
+                    <pic:cNvPr id="0" name="" descr=""/>
+                    <pic:cNvPicPr>
+                      <a:picLocks noChangeAspect="1" noChangeArrowheads="1"/>
+                    </pic:cNvPicPr>
+                  </pic:nvPicPr>
+                  <pic:blipFill>
+                    <a:blip r:embed="rId9" cstate="none"/>
+                    <a:srcRect/>
+                    <a:stretch>
+                      <a:fillRect/>
+                    </a:stretch>
+                  </pic:blipFill>
+                  <pic:spPr bwMode="auto">
+                    <a:xfrm>
+                      <a:off x="0" y="0"/>
+                      <a:ext cx="1905000" cy="1238250"/>
+                    </a:xfrm>
+                    <a:prstGeom prst="rect">
+                      <a:avLst/>
+                    </a:prstGeom>
+                  </pic:spPr>
+                </pic:pic>
+              </a:graphicData>
+            </a:graphic>
+          </wp:inline>
+        </w:drawing>
+      </w:r>
+    </w:p>
+    <w:p>
+      <w:pPr>
+        <w:spacing w:after="50"/>
         <w:ind w:left="400"/>
       </w:pPr>
       <w:r>
@@ -1417,7 +1831,53 @@
     </w:p>
     <w:p>
       <w:pPr>
-        <w:spacing w:after="60"/>
+        <w:spacing w:after="80"/>
+        <w:ind w:left="600"/>
+      </w:pPr>
+      <w:r>
+        <w:drawing>
+          <wp:inline distT="0" distB="0" distL="0" distR="0">
+            <wp:extent cx="1905000" cy="1238250"/>
+            <wp:effectExtent t="0" r="0" b="0" l="0"/>
+            <wp:docPr id="1" name="" descr="" title=""/>
+            <wp:cNvGraphicFramePr>
+              <a:graphicFrameLocks xmlns:a="http://schemas.openxmlformats.org/drawingml/2006/main" noChangeAspect="1"/>
+            </wp:cNvGraphicFramePr>
+            <a:graphic xmlns:a="http://schemas.openxmlformats.org/drawingml/2006/main">
+              <a:graphicData uri="http://schemas.openxmlformats.org/drawingml/2006/picture">
+                <pic:pic xmlns:pic="http://schemas.openxmlformats.org/drawingml/2006/picture">
+                  <pic:nvPicPr>
+                    <pic:cNvPr id="0" name="" descr=""/>
+                    <pic:cNvPicPr>
+                      <a:picLocks noChangeAspect="1" noChangeArrowheads="1"/>
+                    </pic:cNvPicPr>
+                  </pic:nvPicPr>
+                  <pic:blipFill>
+                    <a:blip r:embed="rId11" cstate="none"/>
+                    <a:srcRect/>
+                    <a:stretch>
+                      <a:fillRect/>
+                    </a:stretch>
+                  </pic:blipFill>
+                  <pic:spPr bwMode="auto">
+                    <a:xfrm>
+                      <a:off x="0" y="0"/>
+                      <a:ext cx="1905000" cy="1238250"/>
+                    </a:xfrm>
+                    <a:prstGeom prst="rect">
+                      <a:avLst/>
+                    </a:prstGeom>
+                  </pic:spPr>
+                </pic:pic>
+              </a:graphicData>
+            </a:graphic>
+          </wp:inline>
+        </w:drawing>
+      </w:r>
+    </w:p>
+    <w:p>
+      <w:pPr>
+        <w:spacing w:after="50"/>
         <w:ind w:left="400"/>
       </w:pPr>
       <w:r>
@@ -1430,7 +1890,53 @@
     </w:p>
     <w:p>
       <w:pPr>
-        <w:spacing w:after="60"/>
+        <w:spacing w:after="80"/>
+        <w:ind w:left="600"/>
+      </w:pPr>
+      <w:r>
+        <w:drawing>
+          <wp:inline distT="0" distB="0" distL="0" distR="0">
+            <wp:extent cx="1905000" cy="1238250"/>
+            <wp:effectExtent t="0" r="0" b="0" l="0"/>
+            <wp:docPr id="1" name="" descr="" title=""/>
+            <wp:cNvGraphicFramePr>
+              <a:graphicFrameLocks xmlns:a="http://schemas.openxmlformats.org/drawingml/2006/main" noChangeAspect="1"/>
+            </wp:cNvGraphicFramePr>
+            <a:graphic xmlns:a="http://schemas.openxmlformats.org/drawingml/2006/main">
+              <a:graphicData uri="http://schemas.openxmlformats.org/drawingml/2006/picture">
+                <pic:pic xmlns:pic="http://schemas.openxmlformats.org/drawingml/2006/picture">
+                  <pic:nvPicPr>
+                    <pic:cNvPr id="0" name="" descr=""/>
+                    <pic:cNvPicPr>
+                      <a:picLocks noChangeAspect="1" noChangeArrowheads="1"/>
+                    </pic:cNvPicPr>
+                  </pic:nvPicPr>
+                  <pic:blipFill>
+                    <a:blip r:embed="rId13" cstate="none"/>
+                    <a:srcRect/>
+                    <a:stretch>
+                      <a:fillRect/>
+                    </a:stretch>
+                  </pic:blipFill>
+                  <pic:spPr bwMode="auto">
+                    <a:xfrm>
+                      <a:off x="0" y="0"/>
+                      <a:ext cx="1905000" cy="1238250"/>
+                    </a:xfrm>
+                    <a:prstGeom prst="rect">
+                      <a:avLst/>
+                    </a:prstGeom>
+                  </pic:spPr>
+                </pic:pic>
+              </a:graphicData>
+            </a:graphic>
+          </wp:inline>
+        </w:drawing>
+      </w:r>
+    </w:p>
+    <w:p>
+      <w:pPr>
+        <w:spacing w:after="50"/>
         <w:ind w:left="400"/>
       </w:pPr>
       <w:r>
@@ -1443,7 +1949,53 @@
     </w:p>
     <w:p>
       <w:pPr>
-        <w:spacing w:after="200"/>
+        <w:spacing w:after="80"/>
+        <w:ind w:left="600"/>
+      </w:pPr>
+      <w:r>
+        <w:drawing>
+          <wp:inline distT="0" distB="0" distL="0" distR="0">
+            <wp:extent cx="1905000" cy="1238250"/>
+            <wp:effectExtent t="0" r="0" b="0" l="0"/>
+            <wp:docPr id="1" name="" descr="" title=""/>
+            <wp:cNvGraphicFramePr>
+              <a:graphicFrameLocks xmlns:a="http://schemas.openxmlformats.org/drawingml/2006/main" noChangeAspect="1"/>
+            </wp:cNvGraphicFramePr>
+            <a:graphic xmlns:a="http://schemas.openxmlformats.org/drawingml/2006/main">
+              <a:graphicData uri="http://schemas.openxmlformats.org/drawingml/2006/picture">
+                <pic:pic xmlns:pic="http://schemas.openxmlformats.org/drawingml/2006/picture">
+                  <pic:nvPicPr>
+                    <pic:cNvPr id="0" name="" descr=""/>
+                    <pic:cNvPicPr>
+                      <a:picLocks noChangeAspect="1" noChangeArrowheads="1"/>
+                    </pic:cNvPicPr>
+                  </pic:nvPicPr>
+                  <pic:blipFill>
+                    <a:blip r:embed="rId10" cstate="none"/>
+                    <a:srcRect/>
+                    <a:stretch>
+                      <a:fillRect/>
+                    </a:stretch>
+                  </pic:blipFill>
+                  <pic:spPr bwMode="auto">
+                    <a:xfrm>
+                      <a:off x="0" y="0"/>
+                      <a:ext cx="1905000" cy="1238250"/>
+                    </a:xfrm>
+                    <a:prstGeom prst="rect">
+                      <a:avLst/>
+                    </a:prstGeom>
+                  </pic:spPr>
+                </pic:pic>
+              </a:graphicData>
+            </a:graphic>
+          </wp:inline>
+        </w:drawing>
+      </w:r>
+    </w:p>
+    <w:p>
+      <w:pPr>
+        <w:spacing w:after="180" w:before="50"/>
         <w:ind w:left="400"/>
       </w:pPr>
       <w:r>
@@ -1459,7 +2011,7 @@
     </w:p>
     <w:p>
       <w:pPr>
-        <w:spacing w:after="100" w:before="240"/>
+        <w:spacing w:after="100" w:before="200"/>
       </w:pPr>
       <w:r>
         <w:rPr>
@@ -1473,7 +2025,53 @@
     </w:p>
     <w:p>
       <w:pPr>
-        <w:spacing w:after="60"/>
+        <w:spacing w:after="140"/>
+        <w:ind w:left="400"/>
+      </w:pPr>
+      <w:r>
+        <w:drawing>
+          <wp:inline distT="0" distB="0" distL="0" distR="0">
+            <wp:extent cx="3048000" cy="2000250"/>
+            <wp:effectExtent t="0" r="0" b="0" l="0"/>
+            <wp:docPr id="1" name="" descr="" title=""/>
+            <wp:cNvGraphicFramePr>
+              <a:graphicFrameLocks xmlns:a="http://schemas.openxmlformats.org/drawingml/2006/main" noChangeAspect="1"/>
+            </wp:cNvGraphicFramePr>
+            <a:graphic xmlns:a="http://schemas.openxmlformats.org/drawingml/2006/main">
+              <a:graphicData uri="http://schemas.openxmlformats.org/drawingml/2006/picture">
+                <pic:pic xmlns:pic="http://schemas.openxmlformats.org/drawingml/2006/picture">
+                  <pic:nvPicPr>
+                    <pic:cNvPr id="0" name="" descr=""/>
+                    <pic:cNvPicPr>
+                      <a:picLocks noChangeAspect="1" noChangeArrowheads="1"/>
+                    </pic:cNvPicPr>
+                  </pic:nvPicPr>
+                  <pic:blipFill>
+                    <a:blip r:embed="rId14" cstate="none"/>
+                    <a:srcRect/>
+                    <a:stretch>
+                      <a:fillRect/>
+                    </a:stretch>
+                  </pic:blipFill>
+                  <pic:spPr bwMode="auto">
+                    <a:xfrm>
+                      <a:off x="0" y="0"/>
+                      <a:ext cx="3048000" cy="2000250"/>
+                    </a:xfrm>
+                    <a:prstGeom prst="rect">
+                      <a:avLst/>
+                    </a:prstGeom>
+                  </pic:spPr>
+                </pic:pic>
+              </a:graphicData>
+            </a:graphic>
+          </wp:inline>
+        </w:drawing>
+      </w:r>
+    </w:p>
+    <w:p>
+      <w:pPr>
+        <w:spacing w:after="50"/>
         <w:ind w:left="400"/>
       </w:pPr>
       <w:r>
@@ -1486,7 +2084,7 @@
     </w:p>
     <w:p>
       <w:pPr>
-        <w:spacing w:after="60"/>
+        <w:spacing w:after="50"/>
         <w:ind w:left="400"/>
       </w:pPr>
       <w:r>
@@ -1499,7 +2097,7 @@
     </w:p>
     <w:p>
       <w:pPr>
-        <w:spacing w:after="60"/>
+        <w:spacing w:after="50"/>
         <w:ind w:left="400"/>
       </w:pPr>
       <w:r>
@@ -1512,7 +2110,7 @@
     </w:p>
     <w:p>
       <w:pPr>
-        <w:spacing w:after="60"/>
+        <w:spacing w:after="50"/>
         <w:ind w:left="400"/>
       </w:pPr>
       <w:r>
@@ -1525,7 +2123,7 @@
     </w:p>
     <w:p>
       <w:pPr>
-        <w:spacing w:after="60"/>
+        <w:spacing w:after="50"/>
         <w:ind w:left="400"/>
       </w:pPr>
       <w:r>
@@ -1538,7 +2136,7 @@
     </w:p>
     <w:p>
       <w:pPr>
-        <w:spacing w:after="200"/>
+        <w:spacing w:after="180" w:before="50"/>
         <w:ind w:left="400"/>
       </w:pPr>
       <w:r>
@@ -1554,7 +2152,7 @@
     </w:p>
     <w:p>
       <w:pPr>
-        <w:spacing w:after="100" w:before="240"/>
+        <w:spacing w:after="100" w:before="200"/>
       </w:pPr>
       <w:r>
         <w:rPr>
@@ -1568,7 +2166,7 @@
     </w:p>
     <w:p>
       <w:pPr>
-        <w:spacing w:after="60"/>
+        <w:spacing w:after="50"/>
         <w:ind w:left="400"/>
       </w:pPr>
       <w:r>
@@ -1581,7 +2179,7 @@
     </w:p>
     <w:p>
       <w:pPr>
-        <w:spacing w:after="60"/>
+        <w:spacing w:after="50"/>
         <w:ind w:left="400"/>
       </w:pPr>
       <w:r>
@@ -1594,7 +2192,7 @@
     </w:p>
     <w:p>
       <w:pPr>
-        <w:spacing w:after="60"/>
+        <w:spacing w:after="50"/>
         <w:ind w:left="400"/>
       </w:pPr>
       <w:r>
@@ -1607,7 +2205,7 @@
     </w:p>
     <w:p>
       <w:pPr>
-        <w:spacing w:after="60"/>
+        <w:spacing w:after="50"/>
         <w:ind w:left="400"/>
       </w:pPr>
       <w:r>
@@ -1620,7 +2218,7 @@
     </w:p>
     <w:p>
       <w:pPr>
-        <w:spacing w:after="60"/>
+        <w:spacing w:after="50"/>
         <w:ind w:left="400"/>
       </w:pPr>
       <w:r>
@@ -1633,7 +2231,7 @@
     </w:p>
     <w:p>
       <w:pPr>
-        <w:spacing w:after="200"/>
+        <w:spacing w:after="180" w:before="50"/>
         <w:ind w:left="400"/>
       </w:pPr>
       <w:r>
@@ -1649,7 +2247,7 @@
     </w:p>
     <w:p>
       <w:pPr>
-        <w:spacing w:after="100" w:before="240"/>
+        <w:spacing w:after="100" w:before="200"/>
       </w:pPr>
       <w:r>
         <w:rPr>
@@ -1663,7 +2261,7 @@
     </w:p>
     <w:p>
       <w:pPr>
-        <w:spacing w:after="60"/>
+        <w:spacing w:after="50"/>
         <w:ind w:left="400"/>
       </w:pPr>
       <w:r>
@@ -1676,7 +2274,7 @@
     </w:p>
     <w:p>
       <w:pPr>
-        <w:spacing w:after="60"/>
+        <w:spacing w:after="50"/>
         <w:ind w:left="400"/>
       </w:pPr>
       <w:r>
@@ -1689,7 +2287,7 @@
     </w:p>
     <w:p>
       <w:pPr>
-        <w:spacing w:after="60"/>
+        <w:spacing w:after="50"/>
         <w:ind w:left="400"/>
       </w:pPr>
       <w:r>
@@ -1702,7 +2300,7 @@
     </w:p>
     <w:p>
       <w:pPr>
-        <w:spacing w:after="60"/>
+        <w:spacing w:after="50"/>
         <w:ind w:left="400"/>
       </w:pPr>
       <w:r>
@@ -1715,7 +2313,7 @@
     </w:p>
     <w:p>
       <w:pPr>
-        <w:spacing w:after="60"/>
+        <w:spacing w:after="50"/>
         <w:ind w:left="400"/>
       </w:pPr>
       <w:r>
@@ -1728,7 +2326,7 @@
     </w:p>
     <w:p>
       <w:pPr>
-        <w:spacing w:after="200"/>
+        <w:spacing w:after="180" w:before="50"/>
         <w:ind w:left="400"/>
       </w:pPr>
       <w:r>
@@ -1744,7 +2342,7 @@
     </w:p>
     <w:p>
       <w:pPr>
-        <w:spacing w:after="100" w:before="240"/>
+        <w:spacing w:after="100" w:before="200"/>
       </w:pPr>
       <w:r>
         <w:rPr>
@@ -1758,7 +2356,7 @@
     </w:p>
     <w:p>
       <w:pPr>
-        <w:spacing w:after="60"/>
+        <w:spacing w:after="50"/>
         <w:ind w:left="400"/>
       </w:pPr>
       <w:r>
@@ -1771,7 +2369,7 @@
     </w:p>
     <w:p>
       <w:pPr>
-        <w:spacing w:after="60"/>
+        <w:spacing w:after="50"/>
         <w:ind w:left="400"/>
       </w:pPr>
       <w:r>
@@ -1784,7 +2382,7 @@
     </w:p>
     <w:p>
       <w:pPr>
-        <w:spacing w:after="60"/>
+        <w:spacing w:after="50"/>
         <w:ind w:left="400"/>
       </w:pPr>
       <w:r>
@@ -1797,7 +2395,7 @@
     </w:p>
     <w:p>
       <w:pPr>
-        <w:spacing w:after="60"/>
+        <w:spacing w:after="50"/>
         <w:ind w:left="400"/>
       </w:pPr>
       <w:r>
@@ -1810,7 +2408,7 @@
     </w:p>
     <w:p>
       <w:pPr>
-        <w:spacing w:after="60"/>
+        <w:spacing w:after="50"/>
         <w:ind w:left="400"/>
       </w:pPr>
       <w:r>
@@ -1823,7 +2421,7 @@
     </w:p>
     <w:p>
       <w:pPr>
-        <w:spacing w:after="200"/>
+        <w:spacing w:after="180" w:before="50"/>
         <w:ind w:left="400"/>
       </w:pPr>
       <w:r>
@@ -1839,7 +2437,7 @@
     </w:p>
     <w:p>
       <w:pPr>
-        <w:spacing w:after="100" w:before="240"/>
+        <w:spacing w:after="100" w:before="200"/>
       </w:pPr>
       <w:r>
         <w:rPr>
@@ -1853,7 +2451,7 @@
     </w:p>
     <w:p>
       <w:pPr>
-        <w:spacing w:after="60"/>
+        <w:spacing w:after="50"/>
         <w:ind w:left="400"/>
       </w:pPr>
       <w:r>
@@ -1866,7 +2464,7 @@
     </w:p>
     <w:p>
       <w:pPr>
-        <w:spacing w:after="60"/>
+        <w:spacing w:after="50"/>
         <w:ind w:left="400"/>
       </w:pPr>
       <w:r>
@@ -1879,7 +2477,7 @@
     </w:p>
     <w:p>
       <w:pPr>
-        <w:spacing w:after="60"/>
+        <w:spacing w:after="50"/>
         <w:ind w:left="400"/>
       </w:pPr>
       <w:r>
@@ -1892,7 +2490,7 @@
     </w:p>
     <w:p>
       <w:pPr>
-        <w:spacing w:after="60"/>
+        <w:spacing w:after="50"/>
         <w:ind w:left="400"/>
       </w:pPr>
       <w:r>
@@ -1905,7 +2503,7 @@
     </w:p>
     <w:p>
       <w:pPr>
-        <w:spacing w:after="60"/>
+        <w:spacing w:after="50"/>
         <w:ind w:left="400"/>
       </w:pPr>
       <w:r>
@@ -1918,7 +2516,7 @@
     </w:p>
     <w:p>
       <w:pPr>
-        <w:spacing w:after="200"/>
+        <w:spacing w:after="180" w:before="50"/>
         <w:ind w:left="400"/>
       </w:pPr>
       <w:r>
@@ -1934,7 +2532,7 @@
     </w:p>
     <w:p>
       <w:pPr>
-        <w:spacing w:after="100" w:before="240"/>
+        <w:spacing w:after="100" w:before="200"/>
       </w:pPr>
       <w:r>
         <w:rPr>
@@ -1948,7 +2546,7 @@
     </w:p>
     <w:p>
       <w:pPr>
-        <w:spacing w:after="60"/>
+        <w:spacing w:after="50"/>
         <w:ind w:left="400"/>
       </w:pPr>
       <w:r>
@@ -1961,7 +2559,7 @@
     </w:p>
     <w:p>
       <w:pPr>
-        <w:spacing w:after="60"/>
+        <w:spacing w:after="50"/>
         <w:ind w:left="400"/>
       </w:pPr>
       <w:r>
@@ -1974,7 +2572,7 @@
     </w:p>
     <w:p>
       <w:pPr>
-        <w:spacing w:after="60"/>
+        <w:spacing w:after="50"/>
         <w:ind w:left="400"/>
       </w:pPr>
       <w:r>
@@ -1987,7 +2585,7 @@
     </w:p>
     <w:p>
       <w:pPr>
-        <w:spacing w:after="60"/>
+        <w:spacing w:after="50"/>
         <w:ind w:left="400"/>
       </w:pPr>
       <w:r>
@@ -2000,7 +2598,7 @@
     </w:p>
     <w:p>
       <w:pPr>
-        <w:spacing w:after="60"/>
+        <w:spacing w:after="50"/>
         <w:ind w:left="400"/>
       </w:pPr>
       <w:r>
@@ -2013,7 +2611,7 @@
     </w:p>
     <w:p>
       <w:pPr>
-        <w:spacing w:after="200"/>
+        <w:spacing w:after="180" w:before="50"/>
         <w:ind w:left="400"/>
       </w:pPr>
       <w:r>
@@ -2029,7 +2627,7 @@
     </w:p>
     <w:p>
       <w:pPr>
-        <w:spacing w:after="100" w:before="240"/>
+        <w:spacing w:after="100" w:before="200"/>
       </w:pPr>
       <w:r>
         <w:rPr>
@@ -2043,7 +2641,7 @@
     </w:p>
     <w:p>
       <w:pPr>
-        <w:spacing w:after="60"/>
+        <w:spacing w:after="50"/>
         <w:ind w:left="400"/>
       </w:pPr>
       <w:r>
@@ -2056,7 +2654,7 @@
     </w:p>
     <w:p>
       <w:pPr>
-        <w:spacing w:after="60"/>
+        <w:spacing w:after="50"/>
         <w:ind w:left="400"/>
       </w:pPr>
       <w:r>
@@ -2069,7 +2667,7 @@
     </w:p>
     <w:p>
       <w:pPr>
-        <w:spacing w:after="60"/>
+        <w:spacing w:after="50"/>
         <w:ind w:left="400"/>
       </w:pPr>
       <w:r>
@@ -2082,7 +2680,7 @@
     </w:p>
     <w:p>
       <w:pPr>
-        <w:spacing w:after="60"/>
+        <w:spacing w:after="50"/>
         <w:ind w:left="400"/>
       </w:pPr>
       <w:r>
@@ -2095,7 +2693,7 @@
     </w:p>
     <w:p>
       <w:pPr>
-        <w:spacing w:after="60"/>
+        <w:spacing w:after="50"/>
         <w:ind w:left="400"/>
       </w:pPr>
       <w:r>
@@ -2108,7 +2706,7 @@
     </w:p>
     <w:p>
       <w:pPr>
-        <w:spacing w:after="200"/>
+        <w:spacing w:after="180" w:before="50"/>
         <w:ind w:left="400"/>
       </w:pPr>
       <w:r>
@@ -2124,7 +2722,7 @@
     </w:p>
     <w:p>
       <w:pPr>
-        <w:spacing w:after="100" w:before="240"/>
+        <w:spacing w:after="100" w:before="200"/>
       </w:pPr>
       <w:r>
         <w:rPr>
@@ -2138,7 +2736,7 @@
     </w:p>
     <w:p>
       <w:pPr>
-        <w:spacing w:after="60"/>
+        <w:spacing w:after="50"/>
         <w:ind w:left="400"/>
       </w:pPr>
       <w:r>
@@ -2151,7 +2749,7 @@
     </w:p>
     <w:p>
       <w:pPr>
-        <w:spacing w:after="60"/>
+        <w:spacing w:after="50"/>
         <w:ind w:left="400"/>
       </w:pPr>
       <w:r>
@@ -2164,7 +2762,7 @@
     </w:p>
     <w:p>
       <w:pPr>
-        <w:spacing w:after="60"/>
+        <w:spacing w:after="50"/>
         <w:ind w:left="400"/>
       </w:pPr>
       <w:r>
@@ -2177,7 +2775,7 @@
     </w:p>
     <w:p>
       <w:pPr>
-        <w:spacing w:after="60"/>
+        <w:spacing w:after="50"/>
         <w:ind w:left="400"/>
       </w:pPr>
       <w:r>
@@ -2190,7 +2788,7 @@
     </w:p>
     <w:p>
       <w:pPr>
-        <w:spacing w:after="60"/>
+        <w:spacing w:after="50"/>
         <w:ind w:left="400"/>
       </w:pPr>
       <w:r>
@@ -2203,7 +2801,7 @@
     </w:p>
     <w:p>
       <w:pPr>
-        <w:spacing w:after="200"/>
+        <w:spacing w:after="180" w:before="50"/>
         <w:ind w:left="400"/>
       </w:pPr>
       <w:r>
@@ -2219,7 +2817,7 @@
     </w:p>
     <w:p>
       <w:pPr>
-        <w:spacing w:after="100" w:before="240"/>
+        <w:spacing w:after="100" w:before="200"/>
       </w:pPr>
       <w:r>
         <w:rPr>
@@ -2233,7 +2831,7 @@
     </w:p>
     <w:p>
       <w:pPr>
-        <w:spacing w:after="60"/>
+        <w:spacing w:after="50"/>
         <w:ind w:left="400"/>
       </w:pPr>
       <w:r>
@@ -2246,7 +2844,7 @@
     </w:p>
     <w:p>
       <w:pPr>
-        <w:spacing w:after="60"/>
+        <w:spacing w:after="50"/>
         <w:ind w:left="400"/>
       </w:pPr>
       <w:r>
@@ -2259,7 +2857,7 @@
     </w:p>
     <w:p>
       <w:pPr>
-        <w:spacing w:after="60"/>
+        <w:spacing w:after="50"/>
         <w:ind w:left="400"/>
       </w:pPr>
       <w:r>
@@ -2272,7 +2870,7 @@
     </w:p>
     <w:p>
       <w:pPr>
-        <w:spacing w:after="60"/>
+        <w:spacing w:after="50"/>
         <w:ind w:left="400"/>
       </w:pPr>
       <w:r>
@@ -2285,7 +2883,7 @@
     </w:p>
     <w:p>
       <w:pPr>
-        <w:spacing w:after="60"/>
+        <w:spacing w:after="50"/>
         <w:ind w:left="400"/>
       </w:pPr>
       <w:r>
@@ -2298,7 +2896,7 @@
     </w:p>
     <w:p>
       <w:pPr>
-        <w:spacing w:after="200"/>
+        <w:spacing w:after="180" w:before="50"/>
         <w:ind w:left="400"/>
       </w:pPr>
       <w:r>
@@ -2314,7 +2912,7 @@
     </w:p>
     <w:p>
       <w:pPr>
-        <w:spacing w:after="100" w:before="240"/>
+        <w:spacing w:after="100" w:before="200"/>
       </w:pPr>
       <w:r>
         <w:rPr>
@@ -2328,7 +2926,7 @@
     </w:p>
     <w:p>
       <w:pPr>
-        <w:spacing w:after="60"/>
+        <w:spacing w:after="50"/>
         <w:ind w:left="400"/>
       </w:pPr>
       <w:r>
@@ -2341,7 +2939,7 @@
     </w:p>
     <w:p>
       <w:pPr>
-        <w:spacing w:after="60"/>
+        <w:spacing w:after="50"/>
         <w:ind w:left="400"/>
       </w:pPr>
       <w:r>
@@ -2354,7 +2952,7 @@
     </w:p>
     <w:p>
       <w:pPr>
-        <w:spacing w:after="60"/>
+        <w:spacing w:after="50"/>
         <w:ind w:left="400"/>
       </w:pPr>
       <w:r>
@@ -2367,7 +2965,7 @@
     </w:p>
     <w:p>
       <w:pPr>
-        <w:spacing w:after="60"/>
+        <w:spacing w:after="50"/>
         <w:ind w:left="400"/>
       </w:pPr>
       <w:r>
@@ -2380,7 +2978,7 @@
     </w:p>
     <w:p>
       <w:pPr>
-        <w:spacing w:after="60"/>
+        <w:spacing w:after="50"/>
         <w:ind w:left="400"/>
       </w:pPr>
       <w:r>
@@ -2393,7 +2991,7 @@
     </w:p>
     <w:p>
       <w:pPr>
-        <w:spacing w:after="200"/>
+        <w:spacing w:after="180" w:before="50"/>
         <w:ind w:left="400"/>
       </w:pPr>
       <w:r>

</xml_diff>